<commit_message>
make cases stand out more; try to improve backward-compatibility; advance version to 1.0.23
</commit_message>
<xml_diff>
--- a/docassemble/MLHPPOAndProposedOrder/data/templates/cc_375_statement_of_facts.docx
+++ b/docassemble/MLHPPOAndProposedOrder/data/templates/cc_375_statement_of_facts.docx
@@ -11492,32 +11492,71 @@
     </w:p>
     <w:p/>
     <w:p>
+      <w:pPr>
+        <w:tabs>
+          <w:tab w:val="left" w:pos="360"/>
+        </w:tabs>
+        <w:rPr>
+          <w:b/>
+          <w:bCs/>
+        </w:rPr>
+      </w:pPr>
       <w:r>
         <w:tab/>
+      </w:r>
+      <w:r>
+        <w:rPr>
+          <w:b/>
+          <w:bCs/>
+        </w:rPr>
         <w:t xml:space="preserve">Case number: </w:t>
       </w:r>
       <w:proofErr w:type="gramStart"/>
       <w:r>
+        <w:rPr>
+          <w:b/>
+          <w:bCs/>
+        </w:rPr>
         <w:t xml:space="preserve">{{ </w:t>
       </w:r>
       <w:proofErr w:type="spellStart"/>
       <w:r>
+        <w:rPr>
+          <w:b/>
+          <w:bCs/>
+        </w:rPr>
         <w:t>action</w:t>
       </w:r>
       <w:proofErr w:type="gramEnd"/>
       <w:r>
+        <w:rPr>
+          <w:b/>
+          <w:bCs/>
+        </w:rPr>
         <w:t>.docket_</w:t>
       </w:r>
       <w:proofErr w:type="gramStart"/>
       <w:r>
+        <w:rPr>
+          <w:b/>
+          <w:bCs/>
+        </w:rPr>
         <w:t>number</w:t>
       </w:r>
       <w:proofErr w:type="spellEnd"/>
       <w:r>
+        <w:rPr>
+          <w:b/>
+          <w:bCs/>
+        </w:rPr>
         <w:t xml:space="preserve"> }</w:t>
       </w:r>
       <w:proofErr w:type="gramEnd"/>
       <w:r>
+        <w:rPr>
+          <w:b/>
+          <w:bCs/>
+        </w:rPr>
         <w:t>}</w:t>
       </w:r>
     </w:p>
@@ -12162,32 +12201,66 @@
     </w:p>
     <w:p/>
     <w:p>
-      <w:r>
-        <w:tab/>
+      <w:pPr>
+        <w:ind w:firstLine="360"/>
+        <w:rPr>
+          <w:b/>
+          <w:bCs/>
+        </w:rPr>
+      </w:pPr>
+      <w:r>
+        <w:rPr>
+          <w:b/>
+          <w:bCs/>
+        </w:rPr>
         <w:t xml:space="preserve">Case number: </w:t>
       </w:r>
       <w:proofErr w:type="gramStart"/>
       <w:r>
+        <w:rPr>
+          <w:b/>
+          <w:bCs/>
+        </w:rPr>
         <w:t xml:space="preserve">{{ </w:t>
       </w:r>
       <w:proofErr w:type="spellStart"/>
       <w:r>
+        <w:rPr>
+          <w:b/>
+          <w:bCs/>
+        </w:rPr>
         <w:t>order</w:t>
       </w:r>
       <w:proofErr w:type="gramEnd"/>
       <w:r>
+        <w:rPr>
+          <w:b/>
+          <w:bCs/>
+        </w:rPr>
         <w:t>.docket_</w:t>
       </w:r>
       <w:proofErr w:type="gramStart"/>
       <w:r>
+        <w:rPr>
+          <w:b/>
+          <w:bCs/>
+        </w:rPr>
         <w:t>number</w:t>
       </w:r>
       <w:proofErr w:type="spellEnd"/>
       <w:r>
+        <w:rPr>
+          <w:b/>
+          <w:bCs/>
+        </w:rPr>
         <w:t xml:space="preserve"> }</w:t>
       </w:r>
       <w:proofErr w:type="gramEnd"/>
       <w:r>
+        <w:rPr>
+          <w:b/>
+          <w:bCs/>
+        </w:rPr>
         <w:t>}</w:t>
       </w:r>
     </w:p>

</xml_diff>